<commit_message>
Parlar Ioniano: selkeä aloitus, neljä vaihetta ja yhtenäiset viikko-ohjeet
Aloitus (englanniksi) kertoo, mitä rakennetaan ja miten edetään: oppijan
työnkulun havainnekuva, neljä numeroitua vaihetta vaihekuvineen, viikkosivun
käyttöohje ja avattavat osiot (sivuston osat ja työkalut rakennekuvineen,
dokumenttien tehtävät, vaatimus–ehdotus–päätös, arviointi). Kaikilla 11
työviikolla oma yhteys ja tavoite; askellistat ovat työvaiheita osineen (39
työvaihetta, 178 osaa). Tunnukset, järjestys ja merkitys ennallaan, joten
opiskelijoiden vanhat rastit siirtyvät osiin (testattu). Ristiriidat
ratkaistu linjausten Y1–Y4 mukaan (sovittu tietovarasto ja Bootstrap,
roolit ei nimiä, evidence-matrix.md, opettajan aineisto opiskelijan ohjeen
mukaiseksi). Uusi viikkokaavio virheenkorjausketjusta. Lataukset ja
odotukset rakennettu uudelleen.

Co-Authored-By: Claude Opus 5.5 <noreply@anthropic.com>
</commit_message>
<xml_diff>
--- a/parlar-ioniano/downloads/nayton-dokumentointipohjat.docx
+++ b/parlar-ioniano/downloads/nayton-dokumentointipohjat.docx
@@ -901,7 +901,7 @@
           <w:sz w:val="21"/>
           <w:szCs w:val="21"/>
         </w:rPr>
-        <w:t xml:space="preserve">Keskustelukumppani, rooli ja pvm:</w:t>
+        <w:t xml:space="preserve">Keskustelukumppanin rooli (ei nimeä) ja pvm:</w:t>
       </w:r>
     </w:p>
     <w:p>
@@ -1025,7 +1025,7 @@
                 <w:sz w:val="19"/>
                 <w:szCs w:val="19"/>
               </w:rPr>
-              <w:t xml:space="preserve">Osallistujat ja roolit</w:t>
+              <w:t xml:space="preserve">Osallistujien roolit (ei nimiä)</w:t>
             </w:r>
           </w:p>
         </w:tc>
@@ -1075,7 +1075,7 @@
                 <w:sz w:val="19"/>
                 <w:szCs w:val="19"/>
               </w:rPr>
-              <w:t xml:space="preserve">Testaajan alkuperäinen havainto (hänen sanoillaan)</w:t>
+              <w:t xml:space="preserve">Testaajan havainto hänen sanoillaan (merkitse rooli, ei nimeä)</w:t>
             </w:r>
           </w:p>
         </w:tc>
@@ -1265,7 +1265,7 @@
           <w:sz w:val="21"/>
           <w:szCs w:val="21"/>
         </w:rPr>
-        <w:t xml:space="preserve">Erota aina testaajan sanat omasta tulkinnastasi.</w:t>
+        <w:t xml:space="preserve">Erota aina testaajan sanat omasta tulkinnastasi. Julkiseen repositoryyn kirjataan henkilöistä vain rooli; nimet ohjaajalle Teamsissa tarvittaessa.</w:t>
       </w:r>
     </w:p>
     <w:p>
@@ -3101,7 +3101,7 @@
           <w:sz w:val="21"/>
           <w:szCs w:val="21"/>
         </w:rPr>
-        <w:t xml:space="preserve">Luokat: T01–T04 normaali käyttö · T05–T08 rajat · loput virhetilanteet. Kirjoita odotus ennen testiajoa.</w:t>
+        <w:t xml:space="preserve">Merkitse jokaiselle testitapaukselle luokka: normaali käyttö, raja tai virhetilanne. Kirjoita odotus ennen testiajoa.</w:t>
       </w:r>
     </w:p>
     <w:p>

</xml_diff>